<commit_message>
docs: redesign application brief
</commit_message>
<xml_diff>
--- a/docs/competition/MoonModGuard项目申报书.docx
+++ b/docs/competition/MoonModGuard项目申报书.docx
@@ -4,11 +4,47 @@
   <w:body>
     <w:p>
       <w:pPr>
-        <w:pStyle w:val="Title"/>
         <w:jc w:val="center"/>
       </w:pPr>
       <w:r>
-        <w:t>MoonModGuard 技术白皮书式项目申报书</w:t>
+        <w:rPr>
+          <w:rFonts w:ascii="Microsoft YaHei" w:hAnsi="Microsoft YaHei" w:eastAsia="Microsoft YaHei"/>
+          <w:b/>
+          <w:color w:val="6A7886"/>
+          <w:sz w:val="16"/>
+        </w:rPr>
+        <w:t>MOONBIT OPEN SOURCE BRIEF</w:t>
+      </w:r>
+    </w:p>
+    <w:p>
+      <w:pPr>
+        <w:jc w:val="left"/>
+        <w:pBdr>
+          <w:bottom w:val="single" w:sz="8" w:space="4" w:color="9EB2C5"/>
+        </w:pBdr>
+      </w:pPr>
+      <w:r>
+        <w:rPr>
+          <w:rFonts w:ascii="Microsoft YaHei" w:hAnsi="Microsoft YaHei" w:eastAsia="Microsoft YaHei"/>
+          <w:b/>
+          <w:color w:val="16324F"/>
+          <w:sz w:val="48"/>
+        </w:rPr>
+        <w:t>MoonModGuard 开源技术说明书</w:t>
+      </w:r>
+    </w:p>
+    <w:p>
+      <w:pPr>
+        <w:spacing w:after="200"/>
+      </w:pPr>
+      <w:r>
+        <w:rPr>
+          <w:rFonts w:ascii="Microsoft YaHei" w:hAnsi="Microsoft YaHei" w:eastAsia="Microsoft YaHei"/>
+          <w:b w:val="0"/>
+          <w:color w:val="4A6178"/>
+          <w:sz w:val="24"/>
+        </w:rPr>
+        <w:t>MoonBit 项目清单与供应链策略审计器</w:t>
       </w:r>
     </w:p>
     <w:tbl>
@@ -18,35 +54,14 @@
         <w:tblLook w:firstColumn="1" w:firstRow="1" w:lastColumn="0" w:lastRow="0" w:noHBand="0" w:noVBand="1" w:val="04A0"/>
       </w:tblPr>
       <w:tblGrid>
-        <w:gridCol w:w="4320"/>
-        <w:gridCol w:w="4320"/>
+        <w:gridCol w:w="4997"/>
+        <w:gridCol w:w="4997"/>
       </w:tblGrid>
       <w:tr>
         <w:tc>
           <w:tcPr>
-            <w:tcW w:type="dxa" w:w="4320"/>
-          </w:tcPr>
-          <w:p>
-            <w:r>
-              <w:t>项目名称</w:t>
-            </w:r>
-          </w:p>
-        </w:tc>
-        <w:tc>
-          <w:tcPr>
-            <w:tcW w:type="dxa" w:w="4320"/>
-          </w:tcPr>
-          <w:p>
-            <w:r>
-              <w:t>MoonModGuard：MoonBit 项目清单与供应链策略审计器</w:t>
-            </w:r>
-          </w:p>
-        </w:tc>
-      </w:tr>
-      <w:tr>
-        <w:tc>
-          <w:tcPr>
-            <w:tcW w:type="dxa" w:w="4320"/>
+            <w:tcW w:type="dxa" w:w="4997"/>
+            <w:shd w:fill="E7EEF5"/>
           </w:tcPr>
           <w:p>
             <w:r>
@@ -56,7 +71,8 @@
         </w:tc>
         <w:tc>
           <w:tcPr>
-            <w:tcW w:type="dxa" w:w="4320"/>
+            <w:tcW w:type="dxa" w:w="4997"/>
+            <w:shd w:fill="F7FAFC"/>
           </w:tcPr>
           <w:p>
             <w:r>
@@ -68,7 +84,8 @@
       <w:tr>
         <w:tc>
           <w:tcPr>
-            <w:tcW w:type="dxa" w:w="4320"/>
+            <w:tcW w:type="dxa" w:w="4997"/>
+            <w:shd w:fill="E7EEF5"/>
           </w:tcPr>
           <w:p>
             <w:r>
@@ -78,7 +95,8 @@
         </w:tc>
         <w:tc>
           <w:tcPr>
-            <w:tcW w:type="dxa" w:w="4320"/>
+            <w:tcW w:type="dxa" w:w="4997"/>
+            <w:shd w:fill="F7FAFC"/>
           </w:tcPr>
           <w:p>
             <w:r>
@@ -90,7 +108,8 @@
       <w:tr>
         <w:tc>
           <w:tcPr>
-            <w:tcW w:type="dxa" w:w="4320"/>
+            <w:tcW w:type="dxa" w:w="4997"/>
+            <w:shd w:fill="E7EEF5"/>
           </w:tcPr>
           <w:p>
             <w:r>
@@ -100,7 +119,8 @@
         </w:tc>
         <w:tc>
           <w:tcPr>
-            <w:tcW w:type="dxa" w:w="4320"/>
+            <w:tcW w:type="dxa" w:w="4997"/>
+            <w:shd w:fill="F7FAFC"/>
           </w:tcPr>
           <w:p>
             <w:r>
@@ -112,7 +132,8 @@
       <w:tr>
         <w:tc>
           <w:tcPr>
-            <w:tcW w:type="dxa" w:w="4320"/>
+            <w:tcW w:type="dxa" w:w="4997"/>
+            <w:shd w:fill="E7EEF5"/>
           </w:tcPr>
           <w:p>
             <w:r>
@@ -122,7 +143,8 @@
         </w:tc>
         <w:tc>
           <w:tcPr>
-            <w:tcW w:type="dxa" w:w="4320"/>
+            <w:tcW w:type="dxa" w:w="4997"/>
+            <w:shd w:fill="F7FAFC"/>
           </w:tcPr>
           <w:p>
             <w:r>
@@ -132,113 +154,448 @@
         </w:tc>
       </w:tr>
     </w:tbl>
+    <w:p/>
+    <w:tbl>
+      <w:tblPr>
+        <w:tblStyle w:val="TableGrid"/>
+        <w:tblW w:type="auto" w:w="0"/>
+        <w:tblLook w:firstColumn="1" w:firstRow="1" w:lastColumn="0" w:lastRow="0" w:noHBand="0" w:noVBand="1" w:val="04A0"/>
+      </w:tblPr>
+      <w:tblGrid>
+        <w:gridCol w:w="4997"/>
+        <w:gridCol w:w="4997"/>
+      </w:tblGrid>
+      <w:tr>
+        <w:tc>
+          <w:tcPr>
+            <w:tcW w:type="dxa" w:w="4997"/>
+            <w:shd w:fill="FFFFFF"/>
+          </w:tcPr>
+          <w:p>
+            <w:r/>
+            <w:r>
+              <w:rPr>
+                <w:rFonts w:ascii="Microsoft YaHei" w:hAnsi="Microsoft YaHei" w:eastAsia="Microsoft YaHei"/>
+                <w:b/>
+                <w:color w:val="5F6F80"/>
+                <w:sz w:val="18"/>
+              </w:rPr>
+              <w:t>定位</w:t>
+              <w:br/>
+            </w:r>
+            <w:r>
+              <w:rPr>
+                <w:rFonts w:ascii="Microsoft YaHei" w:hAnsi="Microsoft YaHei" w:eastAsia="Microsoft YaHei"/>
+                <w:b w:val="0"/>
+                <w:color w:val="1F2D3A"/>
+                <w:sz w:val="18"/>
+              </w:rPr>
+              <w:t>面向 MoonBit 工程清单的发布前自检与策略审计工具。</w:t>
+            </w:r>
+          </w:p>
+        </w:tc>
+        <w:tc>
+          <w:tcPr>
+            <w:tcW w:type="dxa" w:w="4997"/>
+            <w:shd w:fill="FFFFFF"/>
+          </w:tcPr>
+          <w:p>
+            <w:r/>
+            <w:r>
+              <w:rPr>
+                <w:rFonts w:ascii="Microsoft YaHei" w:hAnsi="Microsoft YaHei" w:eastAsia="Microsoft YaHei"/>
+                <w:b/>
+                <w:color w:val="5F6F80"/>
+                <w:sz w:val="18"/>
+              </w:rPr>
+              <w:t>对象</w:t>
+              <w:br/>
+            </w:r>
+            <w:r>
+              <w:rPr>
+                <w:rFonts w:ascii="Microsoft YaHei" w:hAnsi="Microsoft YaHei" w:eastAsia="Microsoft YaHei"/>
+                <w:b w:val="0"/>
+                <w:color w:val="1F2D3A"/>
+                <w:sz w:val="18"/>
+              </w:rPr>
+              <w:t>解析 moon.mod、moon.pkg，提取元数据、依赖和导入别名。</w:t>
+            </w:r>
+          </w:p>
+        </w:tc>
+      </w:tr>
+      <w:tr>
+        <w:tc>
+          <w:tcPr>
+            <w:tcW w:type="dxa" w:w="4997"/>
+            <w:shd w:fill="FFFFFF"/>
+          </w:tcPr>
+          <w:p>
+            <w:r/>
+            <w:r>
+              <w:rPr>
+                <w:rFonts w:ascii="Microsoft YaHei" w:hAnsi="Microsoft YaHei" w:eastAsia="Microsoft YaHei"/>
+                <w:b/>
+                <w:color w:val="5F6F80"/>
+                <w:sz w:val="18"/>
+              </w:rPr>
+              <w:t>价值</w:t>
+              <w:br/>
+            </w:r>
+            <w:r>
+              <w:rPr>
+                <w:rFonts w:ascii="Microsoft YaHei" w:hAnsi="Microsoft YaHei" w:eastAsia="Microsoft YaHei"/>
+                <w:b w:val="0"/>
+                <w:color w:val="1F2D3A"/>
+                <w:sz w:val="18"/>
+              </w:rPr>
+              <w:t>补齐清单完整性、许可证策略和依赖透明度检查能力。</w:t>
+            </w:r>
+          </w:p>
+        </w:tc>
+        <w:tc>
+          <w:tcPr>
+            <w:tcW w:type="dxa" w:w="4997"/>
+            <w:shd w:fill="FFFFFF"/>
+          </w:tcPr>
+          <w:p>
+            <w:r/>
+            <w:r>
+              <w:rPr>
+                <w:rFonts w:ascii="Microsoft YaHei" w:hAnsi="Microsoft YaHei" w:eastAsia="Microsoft YaHei"/>
+                <w:b/>
+                <w:color w:val="5F6F80"/>
+                <w:sz w:val="18"/>
+              </w:rPr>
+              <w:t>交付</w:t>
+              <w:br/>
+            </w:r>
+            <w:r>
+              <w:rPr>
+                <w:rFonts w:ascii="Microsoft YaHei" w:hAnsi="Microsoft YaHei" w:eastAsia="Microsoft YaHei"/>
+                <w:b w:val="0"/>
+                <w:color w:val="1F2D3A"/>
+                <w:sz w:val="18"/>
+              </w:rPr>
+              <w:t>提供核心库、CLI 示例、测试、CI、README 与申报材料。</w:t>
+            </w:r>
+          </w:p>
+        </w:tc>
+      </w:tr>
+    </w:tbl>
     <w:p>
       <w:pPr>
-        <w:pStyle w:val="Heading1"/>
+        <w:spacing w:before="180" w:after="60"/>
       </w:pPr>
       <w:r>
-        <w:t>一、项目定位</w:t>
+        <w:rPr>
+          <w:rFonts w:ascii="Microsoft YaHei" w:hAnsi="Microsoft YaHei" w:eastAsia="Microsoft YaHei"/>
+          <w:b/>
+          <w:color w:val="16324F"/>
+          <w:sz w:val="28"/>
+        </w:rPr>
+        <w:t>评审摘要</w:t>
+      </w:r>
+    </w:p>
+    <w:p>
+      <w:pPr>
+        <w:spacing w:line="324" w:lineRule="auto"/>
+        <w:ind w:firstLine="420"/>
+      </w:pPr>
+      <w:r>
+        <w:rPr>
+          <w:rFonts w:ascii="Microsoft YaHei" w:hAnsi="Microsoft YaHei" w:eastAsia="Microsoft YaHei"/>
+          <w:b w:val="0"/>
+          <w:color w:val="202A33"/>
+          <w:sz w:val="20"/>
+        </w:rPr>
+        <w:t>MoonModGuard 面向 MoonBit 项目的工程清单质量与供应链策略检查，提供轻量、可测试、可嵌入的审计内核。它解析 moon.mod 与 moon.pkg 文本，抽取项目元数据、包级依赖、导入别名和发布信息，并将这些信息统一转化为可复查的策略诊断报告。首版优先补齐发布前自检能力，而不是构建平台型服务。</w:t>
+      </w:r>
+    </w:p>
+    <w:p>
+      <w:pPr>
+        <w:spacing w:before="180" w:after="60"/>
+      </w:pPr>
+      <w:r>
+        <w:rPr>
+          <w:rFonts w:ascii="Microsoft YaHei" w:hAnsi="Microsoft YaHei" w:eastAsia="Microsoft YaHei"/>
+          <w:b/>
+          <w:color w:val="16324F"/>
+          <w:sz w:val="28"/>
+        </w:rPr>
+        <w:t>选题价值</w:t>
+      </w:r>
+    </w:p>
+    <w:p>
+      <w:pPr>
+        <w:spacing w:line="324" w:lineRule="auto"/>
+        <w:ind w:firstLine="420"/>
+      </w:pPr>
+      <w:r>
+        <w:rPr>
+          <w:rFonts w:ascii="Microsoft YaHei" w:hAnsi="Microsoft YaHei" w:eastAsia="Microsoft YaHei"/>
+          <w:b w:val="0"/>
+          <w:color w:val="202A33"/>
+          <w:sz w:val="20"/>
+        </w:rPr>
+        <w:t>MoonBit 生态会持续积累包、模板和教学工程。随着项目数量增加，单个仓库是否具备可发布、可维护、可审计的基础条件，会直接影响生态复用效率。MoonModGuard 将人工阅读清单文件的经验沉淀为基础软件能力，适用于包发布、竞赛验收、课程规范检查和后续 CI 策略审计。</w:t>
+      </w:r>
+    </w:p>
+    <w:p>
+      <w:pPr>
+        <w:spacing w:before="180" w:after="60"/>
+      </w:pPr>
+      <w:r>
+        <w:rPr>
+          <w:rFonts w:ascii="Microsoft YaHei" w:hAnsi="Microsoft YaHei" w:eastAsia="Microsoft YaHei"/>
+          <w:b/>
+          <w:color w:val="16324F"/>
+          <w:sz w:val="28"/>
+        </w:rPr>
+        <w:t>技术方案</w:t>
+      </w:r>
+    </w:p>
+    <w:p>
+      <w:pPr>
+        <w:spacing w:line="324" w:lineRule="auto"/>
+        <w:ind w:firstLine="420"/>
+      </w:pPr>
+      <w:r>
+        <w:rPr>
+          <w:rFonts w:ascii="Microsoft YaHei" w:hAnsi="Microsoft YaHei" w:eastAsia="Microsoft YaHei"/>
+          <w:b w:val="0"/>
+          <w:color w:val="202A33"/>
+          <w:sz w:val="20"/>
+        </w:rPr>
+        <w:t>系统采用清单解析层、项目建模层、策略评估层和报告生成层。解析层读取 moon.mod 与 moon.pkg 字符串；建模层合并模块级与包级信息；策略层检查必填元数据、许可证 allowlist、可信依赖前缀和重复依赖；报告层输出稳定 Markdown，供 CLI、CI 或文档系统复用。</w:t>
+      </w:r>
+    </w:p>
+    <w:p>
+      <w:pPr>
+        <w:spacing w:before="180" w:after="60"/>
+      </w:pPr>
+      <w:r>
+        <w:rPr>
+          <w:rFonts w:ascii="Microsoft YaHei" w:hAnsi="Microsoft YaHei" w:eastAsia="Microsoft YaHei"/>
+          <w:b/>
+          <w:color w:val="16324F"/>
+          <w:sz w:val="28"/>
+        </w:rPr>
+        <w:t>实现边界</w:t>
+      </w:r>
+    </w:p>
+    <w:p>
+      <w:pPr>
+        <w:spacing w:line="324" w:lineRule="auto"/>
+        <w:ind w:firstLine="420"/>
+      </w:pPr>
+      <w:r>
+        <w:rPr>
+          <w:rFonts w:ascii="Microsoft YaHei" w:hAnsi="Microsoft YaHei" w:eastAsia="Microsoft YaHei"/>
+          <w:b w:val="0"/>
+          <w:color w:val="202A33"/>
+          <w:sz w:val="20"/>
+        </w:rPr>
+        <w:t>首版采用显式输入字符串与内存快照的方式，不做真实文件系统扫描、在线包仓库查询或完整 MoonBit 语法解析。这个边界降低实现风险，使核心逻辑更容易测试，也便于后续扩展真实工作区扫描器。</w:t>
+      </w:r>
+    </w:p>
+    <w:p>
+      <w:pPr>
+        <w:spacing w:before="180" w:after="60"/>
+      </w:pPr>
+      <w:r>
+        <w:rPr>
+          <w:rFonts w:ascii="Microsoft YaHei" w:hAnsi="Microsoft YaHei" w:eastAsia="Microsoft YaHei"/>
+          <w:b/>
+          <w:color w:val="16324F"/>
+          <w:sz w:val="28"/>
+        </w:rPr>
+        <w:t>验证证据</w:t>
+      </w:r>
+    </w:p>
+    <w:p>
+      <w:pPr>
+        <w:spacing w:line="324" w:lineRule="auto"/>
+        <w:ind w:firstLine="420"/>
+      </w:pPr>
+      <w:r>
+        <w:rPr>
+          <w:rFonts w:ascii="Microsoft YaHei" w:hAnsi="Microsoft YaHei" w:eastAsia="Microsoft YaHei"/>
+          <w:b w:val="0"/>
+          <w:color w:val="202A33"/>
+          <w:sz w:val="20"/>
+        </w:rPr>
+        <w:t>当前验证覆盖 moon.mod 标量字段解析、keywords 数组解析、模块级 import 解析、包级 import 解析、缺失元数据诊断、非 allowlist 许可证诊断、未知依赖前缀诊断、重复依赖诊断和 Markdown 报告稳定输出。验证命令包括 moon info、moon fmt --check、moon test 和 moon run cmd/main。</w:t>
+      </w:r>
+    </w:p>
+    <w:p>
+      <w:pPr>
+        <w:spacing w:before="180" w:after="60"/>
+      </w:pPr>
+      <w:r>
+        <w:rPr>
+          <w:rFonts w:ascii="Microsoft YaHei" w:hAnsi="Microsoft YaHei" w:eastAsia="Microsoft YaHei"/>
+          <w:b/>
+          <w:color w:val="16324F"/>
+          <w:sz w:val="28"/>
+        </w:rPr>
+        <w:t>开源计划</w:t>
+      </w:r>
+    </w:p>
+    <w:p>
+      <w:pPr>
+        <w:spacing w:line="324" w:lineRule="auto"/>
+        <w:ind w:firstLine="420"/>
+      </w:pPr>
+      <w:r>
+        <w:rPr>
+          <w:rFonts w:ascii="Microsoft YaHei" w:hAnsi="Microsoft YaHei" w:eastAsia="Microsoft YaHei"/>
+          <w:b w:val="0"/>
+          <w:color w:val="202A33"/>
+          <w:sz w:val="20"/>
+        </w:rPr>
+        <w:t>项目以 GitHub 仓库作为官方开源发布地址，满足赛事阶段一对有效 GitHub 仓库链接的要求；GitLink 仓库作为赛事平台镜像，用于同步提交和平台验收。后续迭代将优先保持核心 API 稳定、测试可复现、报告输出可比对。</w:t>
       </w:r>
     </w:p>
     <w:p>
       <w:r>
-        <w:t>MoonModGuard 是面向 MoonBit 生态的项目清单与供应链策略审计器。项目围绕 moon.mod、moon.pkg 等工程清单文件构建轻量审计内核，提取模块元数据、包级依赖、导入别名和发布信息，并通过策略规则生成可复查的审计报告。项目以 GitHub 仓库作为官方开源发布地址，同时保留 GitLink 仓库作为赛事平台镜像。</w:t>
+        <w:rPr>
+          <w:rFonts w:ascii="Microsoft YaHei" w:hAnsi="Microsoft YaHei" w:eastAsia="Microsoft YaHei"/>
+          <w:b/>
+          <w:color w:val="16324F"/>
+          <w:sz w:val="28"/>
+        </w:rPr>
+        <w:t>核心 API 交付</w:t>
       </w:r>
     </w:p>
-    <w:p>
-      <w:pPr>
-        <w:pStyle w:val="Heading1"/>
-      </w:pPr>
-      <w:r>
-        <w:t>二、问题背景</w:t>
-      </w:r>
-    </w:p>
-    <w:p>
-      <w:r>
-        <w:t>MoonBit 包生态正在增长。一个项目能否稳定发布和复现，不只取决于源码是否能编译，还取决于清单元数据是否完整、许可证是否符合策略、依赖来源是否清晰、包级导入是否可审计。当前很多检查依赖人工阅读，难以形成统一、可测试、可自动化的评审流程。MoonModGuard 将这些工程质量要求转化为可执行规则，为包发布前检查、竞赛仓库验收、课程项目规范检查和后续 CI 集成提供基础组件。</w:t>
-      </w:r>
-    </w:p>
-    <w:p>
-      <w:pPr>
-        <w:pStyle w:val="Heading1"/>
-      </w:pPr>
-      <w:r>
-        <w:t>三、技术架构</w:t>
-      </w:r>
-    </w:p>
-    <w:p>
-      <w:r>
-        <w:t>系统由清单解析层、项目建模层、策略评估层和报告渲染层组成。清单解析层接收 moon.mod 与 moon.pkg 文本，解析标量字段、数组字段和 import 块；项目建模层将 ModuleManifest 与 PackageManifest 合并为 ProjectModel；策略评估层基于 Policy 检查必填元数据、许可证 allowlist、可信依赖前缀和重复依赖；报告渲染层将 AuditReport 输出为稳定 Markdown，供 CLI、CI 和文档系统复用。</w:t>
-      </w:r>
-    </w:p>
-    <w:p>
-      <w:pPr>
-        <w:pStyle w:val="Heading1"/>
-      </w:pPr>
-      <w:r>
-        <w:t>四、核心功能</w:t>
-      </w:r>
-    </w:p>
-    <w:p>
-      <w:r>
-        <w:t>项目实现 parse_mod、parse_pkg、project_from、evaluate_policy、scan_project、render_markdown 与 format_error 等核心 API。默认策略检查缺失 README、缺失 repository、缺失 license、非 allowlist 许可证、未知外部依赖和重复依赖。CLI 示例使用内置项目快照展示审计摘要，便于评审者快速验证项目能力。</w:t>
-      </w:r>
-    </w:p>
-    <w:p>
-      <w:pPr>
-        <w:pStyle w:val="Heading1"/>
-      </w:pPr>
-      <w:r>
-        <w:t>五、创新性说明</w:t>
-      </w:r>
-    </w:p>
-    <w:p>
-      <w:r>
-        <w:t>本项目选择 MoonBit 项目元数据与供应链策略审计这一较冷门但有工程价值的方向，避免与常见格式解析、通用数据结构、解释器、内容寻址或运行日志分析方向重合。项目不追求复杂语法覆盖，而是把 MoonBit 项目的发布准备度、元数据完整性和依赖策略检查抽象为可测试的基础软件能力，具有后续接入 CI、包仓库和教学评测系统的扩展空间。</w:t>
-      </w:r>
-    </w:p>
-    <w:p>
-      <w:pPr>
-        <w:pStyle w:val="Heading1"/>
-      </w:pPr>
-      <w:r>
-        <w:t>六、测试与验证</w:t>
-      </w:r>
-    </w:p>
-    <w:p>
-      <w:r>
-        <w:t>当前验证覆盖 moon.mod 标量字段解析、keywords 数组字段解析、moon.mod import 解析、moon.pkg import 解析、缺失元数据诊断、非 allowlist 许可证诊断、未知依赖前缀诊断、重复依赖诊断和 Markdown 报告稳定输出。项目验证命令包括 moon info、moon fmt --check、moon test 和 moon run cmd/main。</w:t>
-      </w:r>
-    </w:p>
-    <w:p>
-      <w:pPr>
-        <w:pStyle w:val="Heading1"/>
-      </w:pPr>
-      <w:r>
-        <w:t>七、开源交付</w:t>
-      </w:r>
-    </w:p>
-    <w:p>
-      <w:r>
-        <w:t>项目交付独立 MoonBit 审计基础库、可运行 CLI 示例、测试集、README、Apache-2.0 许可证、GitHub Actions 配置、竞赛申报材料和可编辑 DOCX/PDF。GitHub 主仓库用于满足赛事章程第五节阶段一对有效 GitHub 仓库链接的要求；GitLink 镜像仓库用于赛事平台提交与同步验收。</w:t>
-      </w:r>
-    </w:p>
-    <w:p>
-      <w:pPr>
-        <w:pStyle w:val="Heading1"/>
-      </w:pPr>
-      <w:r>
-        <w:t>八、后续计划</w:t>
-      </w:r>
-    </w:p>
-    <w:p>
-      <w:r>
-        <w:t>后续版本可扩展真实文件系统扫描、工作区多包遍历、依赖图可视化、CI 失败阈值、包仓库审计和策略配置文件。首版重点交付可复现、可测试、可演示的审计内核，避免在文件系统、平台集成和网络查询上引入不必要复杂度。</w:t>
-      </w:r>
-    </w:p>
+    <w:tbl>
+      <w:tblPr>
+        <w:tblStyle w:val="TableGrid"/>
+        <w:tblW w:type="auto" w:w="0"/>
+        <w:tblLook w:firstColumn="1" w:firstRow="1" w:lastColumn="0" w:lastRow="0" w:noHBand="0" w:noVBand="1" w:val="04A0"/>
+      </w:tblPr>
+      <w:tblGrid>
+        <w:gridCol w:w="4997"/>
+        <w:gridCol w:w="4997"/>
+      </w:tblGrid>
+      <w:tr>
+        <w:tc>
+          <w:tcPr>
+            <w:tcW w:type="dxa" w:w="4997"/>
+            <w:shd w:fill="EEF4F8"/>
+          </w:tcPr>
+          <w:p>
+            <w:r>
+              <w:t>parse_mod</w:t>
+            </w:r>
+          </w:p>
+        </w:tc>
+        <w:tc>
+          <w:tcPr>
+            <w:tcW w:type="dxa" w:w="4997"/>
+          </w:tcPr>
+          <w:p>
+            <w:r>
+              <w:t>解析模块清单中的名称、版本、许可证、README、仓库、关键词和依赖。</w:t>
+            </w:r>
+          </w:p>
+        </w:tc>
+      </w:tr>
+      <w:tr>
+        <w:tc>
+          <w:tcPr>
+            <w:tcW w:type="dxa" w:w="4997"/>
+            <w:shd w:fill="EEF4F8"/>
+          </w:tcPr>
+          <w:p>
+            <w:r>
+              <w:t>parse_pkg</w:t>
+            </w:r>
+          </w:p>
+        </w:tc>
+        <w:tc>
+          <w:tcPr>
+            <w:tcW w:type="dxa" w:w="4997"/>
+          </w:tcPr>
+          <w:p>
+            <w:r>
+              <w:t>解析包级 import 依赖与别名。</w:t>
+            </w:r>
+          </w:p>
+        </w:tc>
+      </w:tr>
+      <w:tr>
+        <w:tc>
+          <w:tcPr>
+            <w:tcW w:type="dxa" w:w="4997"/>
+            <w:shd w:fill="EEF4F8"/>
+          </w:tcPr>
+          <w:p>
+            <w:r>
+              <w:t>project_from</w:t>
+            </w:r>
+          </w:p>
+        </w:tc>
+        <w:tc>
+          <w:tcPr>
+            <w:tcW w:type="dxa" w:w="4997"/>
+          </w:tcPr>
+          <w:p>
+            <w:r>
+              <w:t>组合模块与包信息，构建统一项目模型。</w:t>
+            </w:r>
+          </w:p>
+        </w:tc>
+      </w:tr>
+      <w:tr>
+        <w:tc>
+          <w:tcPr>
+            <w:tcW w:type="dxa" w:w="4997"/>
+            <w:shd w:fill="EEF4F8"/>
+          </w:tcPr>
+          <w:p>
+            <w:r>
+              <w:t>evaluate_policy</w:t>
+            </w:r>
+          </w:p>
+        </w:tc>
+        <w:tc>
+          <w:tcPr>
+            <w:tcW w:type="dxa" w:w="4997"/>
+          </w:tcPr>
+          <w:p>
+            <w:r>
+              <w:t>依据策略生成元数据、许可证和依赖诊断。</w:t>
+            </w:r>
+          </w:p>
+        </w:tc>
+      </w:tr>
+      <w:tr>
+        <w:tc>
+          <w:tcPr>
+            <w:tcW w:type="dxa" w:w="4997"/>
+            <w:shd w:fill="EEF4F8"/>
+          </w:tcPr>
+          <w:p>
+            <w:r>
+              <w:t>render_markdown</w:t>
+            </w:r>
+          </w:p>
+        </w:tc>
+        <w:tc>
+          <w:tcPr>
+            <w:tcW w:type="dxa" w:w="4997"/>
+          </w:tcPr>
+          <w:p>
+            <w:r>
+              <w:t>输出稳定审计文本，便于提交、比对和 CI 集成。</w:t>
+            </w:r>
+          </w:p>
+        </w:tc>
+      </w:tr>
+    </w:tbl>
     <w:sectPr>
       <w:pgSz w:w="12240" w:h="15840"/>
-      <w:pgMar w:top="1440" w:right="1800" w:bottom="1440" w:left="1800" w:header="720" w:footer="720" w:gutter="0"/>
+      <w:pgMar w:top="1037" w:right="1123" w:bottom="1037" w:left="1123" w:header="720" w:footer="720" w:gutter="0"/>
       <w:cols w:space="720"/>
       <w:docGrid w:linePitch="360"/>
     </w:sectPr>
@@ -610,7 +967,7 @@
     <w:qFormat/>
     <w:rsid w:val="00FC693F"/>
     <w:rPr>
-      <w:rFonts w:ascii="Microsoft YaHei" w:hAnsi="Microsoft YaHei"/>
+      <w:rFonts w:ascii="Microsoft YaHei" w:hAnsi="Microsoft YaHei" w:eastAsia="Microsoft YaHei"/>
       <w:sz w:val="21"/>
     </w:rPr>
   </w:style>

</xml_diff>

<commit_message>
chore: set wyc060514 as core author
</commit_message>
<xml_diff>
--- a/docs/competition/MoonModGuard项目申报书.docx
+++ b/docs/competition/MoonModGuard项目申报书.docx
@@ -101,6 +101,30 @@
           <w:p>
             <w:r>
               <w:t>https://gitlink.org.cn/Wyc060514/moonmodguard</w:t>
+            </w:r>
+          </w:p>
+        </w:tc>
+      </w:tr>
+      <w:tr>
+        <w:tc>
+          <w:tcPr>
+            <w:tcW w:type="dxa" w:w="4997"/>
+            <w:shd w:fill="E7EEF5"/>
+          </w:tcPr>
+          <w:p>
+            <w:r>
+              <w:t>核心作者</w:t>
+            </w:r>
+          </w:p>
+        </w:tc>
+        <w:tc>
+          <w:tcPr>
+            <w:tcW w:type="dxa" w:w="4997"/>
+            <w:shd w:fill="F7FAFC"/>
+          </w:tcPr>
+          <w:p>
+            <w:r>
+              <w:t>wyc060514</w:t>
             </w:r>
           </w:p>
         </w:tc>

</xml_diff>

<commit_message>
docs: add GitHub submission links
</commit_message>
<xml_diff>
--- a/docs/competition/MoonModGuard项目申报书.docx
+++ b/docs/competition/MoonModGuard项目申报书.docx
@@ -8,7 +8,7 @@
         <w:jc w:val="center"/>
       </w:pPr>
       <w:r>
-        <w:t>MoonModGuard 项目申报书</w:t>
+        <w:t>MoonModGuard 技术白皮书式项目申报书</w:t>
       </w:r>
     </w:p>
     <w:tbl>
@@ -50,7 +50,7 @@
           </w:tcPr>
           <w:p>
             <w:r>
-              <w:t>参赛方向</w:t>
+              <w:t>GitHub 主仓库</w:t>
             </w:r>
           </w:p>
         </w:tc>
@@ -60,7 +60,29 @@
           </w:tcPr>
           <w:p>
             <w:r>
-              <w:t>MoonBit 国产基础软件开源生态项目</w:t>
+              <w:t>https://github.com/Noverberrain/MoonModGuard-MoonBit-</w:t>
+            </w:r>
+          </w:p>
+        </w:tc>
+      </w:tr>
+      <w:tr>
+        <w:tc>
+          <w:tcPr>
+            <w:tcW w:type="dxa" w:w="4320"/>
+          </w:tcPr>
+          <w:p>
+            <w:r>
+              <w:t>GitLink 镜像仓库</w:t>
+            </w:r>
+          </w:p>
+        </w:tc>
+        <w:tc>
+          <w:tcPr>
+            <w:tcW w:type="dxa" w:w="4320"/>
+          </w:tcPr>
+          <w:p>
+            <w:r>
+              <w:t>https://gitlink.org.cn/Wyc060514/moonmodguard</w:t>
             </w:r>
           </w:p>
         </w:tc>
@@ -94,7 +116,7 @@
           </w:tcPr>
           <w:p>
             <w:r>
-              <w:t>仓库链接</w:t>
+              <w:t>参赛方向</w:t>
             </w:r>
           </w:p>
         </w:tc>
@@ -104,7 +126,7 @@
           </w:tcPr>
           <w:p>
             <w:r>
-              <w:t>https://gitlink.org.cn/python123/moonmodguard</w:t>
+              <w:t>MoonBit 国产基础软件开源生态项目</w:t>
             </w:r>
           </w:p>
         </w:tc>
@@ -115,12 +137,12 @@
         <w:pStyle w:val="Heading1"/>
       </w:pPr>
       <w:r>
-        <w:t>一、项目简介</w:t>
+        <w:t>一、项目定位</w:t>
       </w:r>
     </w:p>
     <w:p>
       <w:r>
-        <w:t>MoonModGuard 是一个面向 MoonBit 生态的项目清单与供应链策略审计工具。项目解析 moon.mod、moon.pkg 等清单文本，提取模块元数据、包级依赖、导入别名和发布信息，构建项目快照，并根据策略输出元数据完整性、许可证合规性、依赖重复和未知依赖等诊断结果。</w:t>
+        <w:t>MoonModGuard 是面向 MoonBit 生态的项目清单与供应链策略审计器。项目围绕 moon.mod、moon.pkg 等工程清单文件构建轻量审计内核，提取模块元数据、包级依赖、导入别名和发布信息，并通过策略规则生成可复查的审计报告。项目以 GitHub 仓库作为官方开源发布地址，同时保留 GitLink 仓库作为赛事平台镜像。</w:t>
       </w:r>
     </w:p>
     <w:p>
@@ -128,12 +150,12 @@
         <w:pStyle w:val="Heading1"/>
       </w:pPr>
       <w:r>
-        <w:t>二、方向与场景</w:t>
+        <w:t>二、问题背景</w:t>
       </w:r>
     </w:p>
     <w:p>
       <w:r>
-        <w:t>随着 MoonBit 包生态持续增长，项目是否可发布、可复现、可维护，越来越依赖清单元数据和依赖声明质量。MoonModGuard 将这些工程要求转化为可测试的审计规则，可用于包发布前检查、竞赛仓库验收、课程项目规范检查，以及后续 CI 和包仓库审计。</w:t>
+        <w:t>MoonBit 包生态正在增长。一个项目能否稳定发布和复现，不只取决于源码是否能编译，还取决于清单元数据是否完整、许可证是否符合策略、依赖来源是否清晰、包级导入是否可审计。当前很多检查依赖人工阅读，难以形成统一、可测试、可自动化的评审流程。MoonModGuard 将这些工程质量要求转化为可执行规则，为包发布前检查、竞赛仓库验收、课程项目规范检查和后续 CI 集成提供基础组件。</w:t>
       </w:r>
     </w:p>
     <w:p>
@@ -141,12 +163,12 @@
         <w:pStyle w:val="Heading1"/>
       </w:pPr>
       <w:r>
-        <w:t>三、核心功能</w:t>
+        <w:t>三、技术架构</w:t>
       </w:r>
     </w:p>
     <w:p>
       <w:r>
-        <w:t>项目实现 moon.mod 标量字段解析、数组字段解析、moon.mod 与 moon.pkg import 依赖解析、项目模型构建、默认策略评估和 Markdown 报告输出。默认策略检查缺失 README、缺失 repository、缺失 license、非 allowlist 许可证、未知依赖前缀和重复依赖。</w:t>
+        <w:t>系统由清单解析层、项目建模层、策略评估层和报告渲染层组成。清单解析层接收 moon.mod 与 moon.pkg 文本，解析标量字段、数组字段和 import 块；项目建模层将 ModuleManifest 与 PackageManifest 合并为 ProjectModel；策略评估层基于 Policy 检查必填元数据、许可证 allowlist、可信依赖前缀和重复依赖；报告渲染层将 AuditReport 输出为稳定 Markdown，供 CLI、CI 和文档系统复用。</w:t>
       </w:r>
     </w:p>
     <w:p>
@@ -154,12 +176,12 @@
         <w:pStyle w:val="Heading1"/>
       </w:pPr>
       <w:r>
-        <w:t>四、原创性说明</w:t>
+        <w:t>四、核心功能</w:t>
       </w:r>
     </w:p>
     <w:p>
       <w:r>
-        <w:t>本项目为原创项目，不移植已有开源项目。项目聚焦 MoonBit 自身工程元数据和包供应链策略审计，不与常见格式解析、通用数据结构、内容寻址、解释执行或差异算法方向重合。首版不引入外部依赖，优先形成可复用的审计内核。</w:t>
+        <w:t>项目实现 parse_mod、parse_pkg、project_from、evaluate_policy、scan_project、render_markdown 与 format_error 等核心 API。默认策略检查缺失 README、缺失 repository、缺失 license、非 allowlist 许可证、未知外部依赖和重复依赖。CLI 示例使用内置项目快照展示审计摘要，便于评审者快速验证项目能力。</w:t>
       </w:r>
     </w:p>
     <w:p>
@@ -167,12 +189,12 @@
         <w:pStyle w:val="Heading1"/>
       </w:pPr>
       <w:r>
-        <w:t>五、技术路线</w:t>
+        <w:t>五、创新性说明</w:t>
       </w:r>
     </w:p>
     <w:p>
       <w:r>
-        <w:t>系统采用轻量扫描器解析清单文本，生成 ModuleManifest、PackageManifest 和 ProjectModel。策略评估器基于 Policy 输出 AuditReport，报告渲染器将审计结果转换为稳定 Markdown。CLI 使用内置项目样例展示审计摘要，测试覆盖解析、策略诊断和报告渲染。</w:t>
+        <w:t>本项目选择 MoonBit 项目元数据与供应链策略审计这一较冷门但有工程价值的方向，避免与常见格式解析、通用数据结构、解释器、内容寻址或运行日志分析方向重合。项目不追求复杂语法覆盖，而是把 MoonBit 项目的发布准备度、元数据完整性和依赖策略检查抽象为可测试的基础软件能力，具有后续接入 CI、包仓库和教学评测系统的扩展空间。</w:t>
       </w:r>
     </w:p>
     <w:p>
@@ -180,12 +202,38 @@
         <w:pStyle w:val="Heading1"/>
       </w:pPr>
       <w:r>
-        <w:t>六、预期成果</w:t>
+        <w:t>六、测试与验证</w:t>
       </w:r>
     </w:p>
     <w:p>
       <w:r>
-        <w:t>项目交付一个独立 MoonBit 审计基础库、可运行 CLI 示例、覆盖核心场景的测试集、README、竞赛申报材料和可复现仓库。后续可扩展真实文件扫描、工作区遍历、依赖图可视化、CI 失败阈值和包仓库审计能力。</w:t>
+        <w:t>当前验证覆盖 moon.mod 标量字段解析、keywords 数组字段解析、moon.mod import 解析、moon.pkg import 解析、缺失元数据诊断、非 allowlist 许可证诊断、未知依赖前缀诊断、重复依赖诊断和 Markdown 报告稳定输出。项目验证命令包括 moon info、moon fmt --check、moon test 和 moon run cmd/main。</w:t>
+      </w:r>
+    </w:p>
+    <w:p>
+      <w:pPr>
+        <w:pStyle w:val="Heading1"/>
+      </w:pPr>
+      <w:r>
+        <w:t>七、开源交付</w:t>
+      </w:r>
+    </w:p>
+    <w:p>
+      <w:r>
+        <w:t>项目交付独立 MoonBit 审计基础库、可运行 CLI 示例、测试集、README、Apache-2.0 许可证、GitHub Actions 配置、竞赛申报材料和可编辑 DOCX/PDF。GitHub 主仓库用于满足赛事章程第五节阶段一对有效 GitHub 仓库链接的要求；GitLink 镜像仓库用于赛事平台提交与同步验收。</w:t>
+      </w:r>
+    </w:p>
+    <w:p>
+      <w:pPr>
+        <w:pStyle w:val="Heading1"/>
+      </w:pPr>
+      <w:r>
+        <w:t>八、后续计划</w:t>
+      </w:r>
+    </w:p>
+    <w:p>
+      <w:r>
+        <w:t>后续版本可扩展真实文件系统扫描、工作区多包遍历、依赖图可视化、CI 失败阈值、包仓库审计和策略配置文件。首版重点交付可复现、可测试、可演示的审计内核，避免在文件系统、平台集成和网络查询上引入不必要复杂度。</w:t>
       </w:r>
     </w:p>
     <w:sectPr>

</xml_diff>